<commit_message>
Database plan: skeleton first, detail as needed
Co-Authored-By: Claude Fable 5.1 <noreply@anthropic.com>
</commit_message>
<xml_diff>
--- a/docs/database/Leap Database Plan.docx
+++ b/docs/database/Leap Database Plan.docx
@@ -636,6 +636,158 @@
           <w:szCs w:val="22"/>
         </w:rPr>
         <w:t xml:space="preserve">plus a history table per core entity, giving the same "as of" queries a temporal table would.</w:t>
+      </w:r>
+    </w:p>
+    <w:p>
+      <w:pPr>
+        <w:pStyle w:val="Heading2"/>
+        <w:keepNext/>
+        <w:spacing w:after="120" w:before="260"/>
+      </w:pPr>
+      <w:r>
+        <w:rPr>
+          <w:rFonts w:ascii="Calibri" w:cs="Calibri" w:eastAsia="Calibri" w:hAnsi="Calibri"/>
+          <w:b/>
+          <w:bCs/>
+          <w:color w:val="1F6F8B"/>
+          <w:sz w:val="26"/>
+          <w:szCs w:val="26"/>
+        </w:rPr>
+        <w:t xml:space="preserve">Skeleton first, detail as needed</w:t>
+      </w:r>
+    </w:p>
+    <w:p>
+      <w:pPr>
+        <w:spacing w:after="120" w:line="276"/>
+      </w:pPr>
+      <w:r>
+        <w:rPr>
+          <w:rFonts w:ascii="Calibri" w:cs="Calibri" w:eastAsia="Calibri" w:hAnsi="Calibri"/>
+          <w:color w:val="1B2430"/>
+          <w:sz w:val="22"/>
+          <w:szCs w:val="22"/>
+        </w:rPr>
+        <w:t xml:space="preserve">Neither a full schema agreed up front nor a table added whenever someone asks. The split is by how expensive a change is later.</w:t>
+      </w:r>
+    </w:p>
+    <w:p>
+      <w:pPr>
+        <w:pStyle w:val="ListParagraph"/>
+        <w:numPr>
+          <w:ilvl w:val="0"/>
+          <w:numId w:val="2"/>
+        </w:numPr>
+        <w:spacing w:after="60" w:line="264"/>
+      </w:pPr>
+      <w:r>
+        <w:rPr>
+          <w:rFonts w:ascii="Calibri" w:cs="Calibri" w:eastAsia="Calibri" w:hAnsi="Calibri"/>
+          <w:b/>
+          <w:bCs/>
+          <w:color w:val="1B2430"/>
+          <w:sz w:val="22"/>
+          <w:szCs w:val="22"/>
+        </w:rPr>
+        <w:t xml:space="preserve">Agree early, because it is costly to change once data and other apps depend on it: </w:t>
+      </w:r>
+      <w:r>
+        <w:rPr>
+          <w:rFonts w:ascii="Calibri" w:cs="Calibri" w:eastAsia="Calibri" w:hAnsi="Calibri"/>
+          <w:color w:val="1B2430"/>
+          <w:sz w:val="22"/>
+          <w:szCs w:val="22"/>
+        </w:rPr>
+        <w:t xml:space="preserve">the core entities and how they relate, the key strategy and reference scheme, the conventions above, and the engine and hosting.</w:t>
+      </w:r>
+    </w:p>
+    <w:p>
+      <w:pPr>
+        <w:pStyle w:val="ListParagraph"/>
+        <w:numPr>
+          <w:ilvl w:val="0"/>
+          <w:numId w:val="2"/>
+        </w:numPr>
+        <w:spacing w:after="60" w:line="264"/>
+      </w:pPr>
+      <w:r>
+        <w:rPr>
+          <w:rFonts w:ascii="Calibri" w:cs="Calibri" w:eastAsia="Calibri" w:hAnsi="Calibri"/>
+          <w:b/>
+          <w:bCs/>
+          <w:color w:val="1B2430"/>
+          <w:sz w:val="22"/>
+          <w:szCs w:val="22"/>
+        </w:rPr>
+        <w:t xml:space="preserve">Grow piecemeal, because it is cheap: </w:t>
+      </w:r>
+      <w:r>
+        <w:rPr>
+          <w:rFonts w:ascii="Calibri" w:cs="Calibri" w:eastAsia="Calibri" w:hAnsi="Calibri"/>
+          <w:color w:val="1B2430"/>
+          <w:sz w:val="22"/>
+          <w:szCs w:val="22"/>
+        </w:rPr>
+        <w:t xml:space="preserve">columns, lookup values, attachments, extra link tables and views. A column is added when someone has a row to put in it, not before. The "columns worth naming" lists below are a starting point, not a contract.</w:t>
+      </w:r>
+    </w:p>
+    <w:p>
+      <w:pPr>
+        <w:pStyle w:val="ListParagraph"/>
+        <w:numPr>
+          <w:ilvl w:val="0"/>
+          <w:numId w:val="2"/>
+        </w:numPr>
+        <w:spacing w:after="60" w:line="264"/>
+      </w:pPr>
+      <w:r>
+        <w:rPr>
+          <w:rFonts w:ascii="Calibri" w:cs="Calibri" w:eastAsia="Calibri" w:hAnsi="Calibri"/>
+          <w:b/>
+          <w:bCs/>
+          <w:color w:val="1B2430"/>
+          <w:sz w:val="22"/>
+          <w:szCs w:val="22"/>
+        </w:rPr>
+        <w:t xml:space="preserve">Keep change cheap so piecemeal is safe: </w:t>
+      </w:r>
+      <w:r>
+        <w:rPr>
+          <w:rFonts w:ascii="Calibri" w:cs="Calibri" w:eastAsia="Calibri" w:hAnsi="Calibri"/>
+          <w:color w:val="1B2430"/>
+          <w:sz w:val="22"/>
+          <w:szCs w:val="22"/>
+        </w:rPr>
+        <w:t xml:space="preserve">every schema change is a versioned migration, the entry screens are generated from the schema so a new column appears without bespoke work, and other apps read views rather than raw tables so a table can be reshaped without breaking them.</w:t>
+      </w:r>
+    </w:p>
+    <w:p>
+      <w:pPr>
+        <w:pStyle w:val="ListParagraph"/>
+        <w:numPr>
+          <w:ilvl w:val="0"/>
+          <w:numId w:val="2"/>
+        </w:numPr>
+        <w:spacing w:after="60" w:line="264"/>
+      </w:pPr>
+      <w:r>
+        <w:rPr>
+          <w:rFonts w:ascii="Calibri" w:cs="Calibri" w:eastAsia="Calibri" w:hAnsi="Calibri"/>
+          <w:b/>
+          <w:bCs/>
+          <w:color w:val="1B2430"/>
+          <w:sz w:val="22"/>
+          <w:szCs w:val="22"/>
+        </w:rPr>
+        <w:t xml:space="preserve">Watch for the skeleton change in disguise: </w:t>
+      </w:r>
+      <w:r>
+        <w:rPr>
+          <w:rFonts w:ascii="Calibri" w:cs="Calibri" w:eastAsia="Calibri" w:hAnsi="Calibri"/>
+          <w:color w:val="1B2430"/>
+          <w:sz w:val="22"/>
+          <w:szCs w:val="22"/>
+        </w:rPr>
+        <w:t xml:space="preserve">splitting one table into two, or moving a column between tables, is not a small edit. It gets a migration plan and a data check.</w:t>
       </w:r>
     </w:p>
     <w:p>

</xml_diff>